<commit_message>
recipe HTMLs and CSS
3.31.26
4:11 PM
I made folders for recipes. 3 folders, one for each recipe. they all are connected to 1 CSS file that is in recipe 1 folder. it is basic CSS formatting how it looks on the wireframe. :)
</commit_message>
<xml_diff>
--- a/resources/Park-site-plan.docx
+++ b/resources/Park-site-plan.docx
@@ -4,7 +4,7 @@
   <w:body>
     <w:p>
       <w:pPr>
-        <w:pStyle w:val="1"/>
+        <w:pStyle w:val="Heading1"/>
         <w:jc w:val="center"/>
         <w:rPr>
           <w:rFonts w:eastAsia="Times New Roman"/>
@@ -32,7 +32,7 @@
     </w:p>
     <w:p>
       <w:pPr>
-        <w:pStyle w:val="2"/>
+        <w:pStyle w:val="Heading2"/>
         <w:jc w:val="center"/>
         <w:rPr>
           <w:rFonts w:eastAsia="Times New Roman"/>
@@ -60,7 +60,7 @@
     </w:p>
     <w:p>
       <w:pPr>
-        <w:pStyle w:val="2"/>
+        <w:pStyle w:val="Heading2"/>
         <w:jc w:val="center"/>
         <w:rPr>
           <w:rFonts w:eastAsia="Times New Roman"/>
@@ -92,7 +92,7 @@
     </w:p>
     <w:p>
       <w:pPr>
-        <w:pStyle w:val="2"/>
+        <w:pStyle w:val="Heading2"/>
         <w:jc w:val="center"/>
         <w:rPr>
           <w:rFonts w:eastAsia="Times New Roman"/>
@@ -107,7 +107,7 @@
     </w:p>
     <w:p>
       <w:pPr>
-        <w:pStyle w:val="3"/>
+        <w:pStyle w:val="Heading3"/>
         <w:jc w:val="center"/>
         <w:rPr>
           <w:rFonts w:eastAsia="Times New Roman"/>
@@ -122,7 +122,7 @@
     </w:p>
     <w:p>
       <w:pPr>
-        <w:pStyle w:val="a3"/>
+        <w:pStyle w:val="NormalWeb"/>
         <w:jc w:val="center"/>
       </w:pPr>
       <w:r>
@@ -141,7 +141,7 @@
     </w:p>
     <w:p>
       <w:pPr>
-        <w:pStyle w:val="3"/>
+        <w:pStyle w:val="Heading3"/>
         <w:jc w:val="center"/>
         <w:rPr>
           <w:rFonts w:eastAsia="Times New Roman"/>
@@ -156,7 +156,7 @@
     </w:p>
     <w:p>
       <w:pPr>
-        <w:pStyle w:val="a3"/>
+        <w:pStyle w:val="NormalWeb"/>
         <w:jc w:val="center"/>
       </w:pPr>
       <w:r>
@@ -192,7 +192,7 @@
     </w:p>
     <w:p>
       <w:pPr>
-        <w:pStyle w:val="2"/>
+        <w:pStyle w:val="Heading2"/>
         <w:jc w:val="center"/>
         <w:rPr>
           <w:rFonts w:eastAsia="Times New Roman"/>
@@ -207,7 +207,7 @@
     </w:p>
     <w:p>
       <w:pPr>
-        <w:pStyle w:val="3"/>
+        <w:pStyle w:val="Heading3"/>
         <w:jc w:val="center"/>
         <w:rPr>
           <w:rFonts w:eastAsia="Times New Roman"/>
@@ -311,7 +311,7 @@
     </w:p>
     <w:p>
       <w:pPr>
-        <w:pStyle w:val="2"/>
+        <w:pStyle w:val="Heading2"/>
         <w:jc w:val="center"/>
         <w:rPr>
           <w:rFonts w:eastAsia="Times New Roman"/>
@@ -326,7 +326,7 @@
     </w:p>
     <w:p>
       <w:pPr>
-        <w:pStyle w:val="3"/>
+        <w:pStyle w:val="Heading3"/>
         <w:jc w:val="center"/>
         <w:rPr>
           <w:rFonts w:eastAsia="Times New Roman"/>
@@ -625,7 +625,7 @@
     </w:p>
     <w:p>
       <w:pPr>
-        <w:pStyle w:val="3"/>
+        <w:pStyle w:val="Heading3"/>
         <w:jc w:val="center"/>
         <w:rPr>
           <w:rFonts w:eastAsia="Times New Roman"/>
@@ -644,7 +644,7 @@
     </w:p>
     <w:p>
       <w:pPr>
-        <w:pStyle w:val="4"/>
+        <w:pStyle w:val="Heading4"/>
         <w:jc w:val="center"/>
         <w:rPr>
           <w:rFonts w:eastAsia="Times New Roman"/>
@@ -672,7 +672,7 @@
     </w:p>
     <w:p>
       <w:pPr>
-        <w:pStyle w:val="4"/>
+        <w:pStyle w:val="Heading4"/>
         <w:jc w:val="center"/>
         <w:rPr>
           <w:rFonts w:eastAsia="Times New Roman"/>
@@ -721,7 +721,7 @@
     </w:p>
     <w:p>
       <w:pPr>
-        <w:pStyle w:val="3"/>
+        <w:pStyle w:val="Heading3"/>
         <w:jc w:val="center"/>
         <w:rPr>
           <w:rFonts w:eastAsia="Times New Roman"/>
@@ -739,16 +739,16 @@
     </w:p>
     <w:p>
       <w:pPr>
-        <w:pStyle w:val="3"/>
-        <w:jc w:val="center"/>
-        <w:rPr>
-          <w:rFonts w:eastAsia="Times New Roman"/>
-        </w:rPr>
-      </w:pPr>
-    </w:p>
-    <w:p>
-      <w:pPr>
-        <w:pStyle w:val="3"/>
+        <w:pStyle w:val="Heading3"/>
+        <w:jc w:val="center"/>
+        <w:rPr>
+          <w:rFonts w:eastAsia="Times New Roman"/>
+        </w:rPr>
+      </w:pPr>
+    </w:p>
+    <w:p>
+      <w:pPr>
+        <w:pStyle w:val="Heading3"/>
         <w:jc w:val="center"/>
         <w:rPr>
           <w:rFonts w:eastAsia="Times New Roman"/>
@@ -775,7 +775,7 @@
       <w:hyperlink w:history="1">
         <w:r>
           <w:rPr>
-            <w:rStyle w:val="a4"/>
+            <w:rStyle w:val="Hyperlink"/>
           </w:rPr>
           <w:t>Home</w:t>
         </w:r>
@@ -789,7 +789,7 @@
       <w:hyperlink w:history="1">
         <w:r>
           <w:rPr>
-            <w:rStyle w:val="a4"/>
+            <w:rStyle w:val="Hyperlink"/>
           </w:rPr>
           <w:t>Page2</w:t>
         </w:r>
@@ -836,7 +836,7 @@
       <w:hyperlink w:history="1">
         <w:r>
           <w:rPr>
-            <w:rStyle w:val="a4"/>
+            <w:rStyle w:val="Hyperlink"/>
           </w:rPr>
           <w:t>Page3</w:t>
         </w:r>
@@ -1094,7 +1094,6 @@
       <w:pPr>
         <w:jc w:val="center"/>
         <w:rPr>
-          <w:rFonts w:hint="eastAsia"/>
           <w:lang w:eastAsia="ko-KR"/>
         </w:rPr>
       </w:pPr>
@@ -1405,7 +1404,6 @@
       <w:pPr>
         <w:jc w:val="center"/>
         <w:rPr>
-          <w:rFonts w:hint="eastAsia"/>
           <w:lang w:eastAsia="ko-KR"/>
         </w:rPr>
       </w:pPr>
@@ -1436,7 +1434,6 @@
       <w:pPr>
         <w:jc w:val="center"/>
         <w:rPr>
-          <w:rFonts w:hint="eastAsia"/>
           <w:lang w:eastAsia="ko-KR"/>
         </w:rPr>
       </w:pPr>
@@ -1452,7 +1449,6 @@
       <w:pPr>
         <w:jc w:val="center"/>
         <w:rPr>
-          <w:rFonts w:hint="eastAsia"/>
           <w:lang w:eastAsia="ko-KR"/>
         </w:rPr>
       </w:pPr>
@@ -1643,7 +1639,6 @@
       <w:pPr>
         <w:jc w:val="center"/>
         <w:rPr>
-          <w:rFonts w:hint="eastAsia"/>
           <w:lang w:eastAsia="ko-KR"/>
         </w:rPr>
       </w:pPr>
@@ -1665,7 +1660,6 @@
       <w:pPr>
         <w:jc w:val="center"/>
         <w:rPr>
-          <w:rFonts w:hint="eastAsia"/>
           <w:lang w:eastAsia="ko-KR"/>
         </w:rPr>
       </w:pPr>
@@ -1724,352 +1718,6 @@
           <w:lang w:eastAsia="ko-KR"/>
         </w:rPr>
         <w:t>igae</w:t>
-      </w:r>
-    </w:p>
-    <w:p>
-      <w:pPr>
-        <w:jc w:val="center"/>
-        <w:rPr>
-          <w:rFonts w:hint="eastAsia"/>
-          <w:lang w:eastAsia="ko-KR"/>
-        </w:rPr>
-      </w:pPr>
-      <w:r>
-        <w:rPr>
-          <w:lang w:eastAsia="ko-KR"/>
-        </w:rPr>
-        <w:t>https://chef-choice.tistory.com/372</w:t>
-      </w:r>
-      <w:r>
-        <w:rPr>
-          <w:rFonts w:hint="eastAsia"/>
-          <w:lang w:eastAsia="ko-KR"/>
-        </w:rPr>
-        <w:br/>
-      </w:r>
-      <w:r>
-        <w:rPr>
-          <w:rFonts w:hint="eastAsia"/>
-          <w:lang w:eastAsia="ko-KR"/>
-        </w:rPr>
-        <w:t>Beef broth</w:t>
-      </w:r>
-      <w:r>
-        <w:rPr>
-          <w:rFonts w:hint="eastAsia"/>
-          <w:lang w:eastAsia="ko-KR"/>
-        </w:rPr>
-        <w:t>: 1L</w:t>
-      </w:r>
-      <w:r>
-        <w:rPr>
-          <w:rFonts w:hint="eastAsia"/>
-          <w:lang w:eastAsia="ko-KR"/>
-        </w:rPr>
-        <w:br/>
-      </w:r>
-      <w:r>
-        <w:rPr>
-          <w:rFonts w:hint="eastAsia"/>
-          <w:lang w:eastAsia="ko-KR"/>
-        </w:rPr>
-        <w:t>Kimchi: 1 cabbage</w:t>
-      </w:r>
-      <w:r>
-        <w:rPr>
-          <w:rFonts w:hint="eastAsia"/>
-          <w:lang w:eastAsia="ko-KR"/>
-        </w:rPr>
-        <w:br/>
-      </w:r>
-      <w:r>
-        <w:rPr>
-          <w:rFonts w:hint="eastAsia"/>
-          <w:lang w:eastAsia="ko-KR"/>
-        </w:rPr>
-        <w:t>Pork belly: 400g</w:t>
-      </w:r>
-      <w:r>
-        <w:rPr>
-          <w:rFonts w:hint="eastAsia"/>
-          <w:lang w:eastAsia="ko-KR"/>
-        </w:rPr>
-        <w:br/>
-      </w:r>
-      <w:r>
-        <w:rPr>
-          <w:rFonts w:hint="eastAsia"/>
-          <w:lang w:eastAsia="ko-KR"/>
-        </w:rPr>
-        <w:t>Ground red pepper</w:t>
-      </w:r>
-      <w:r>
-        <w:rPr>
-          <w:rFonts w:hint="eastAsia"/>
-          <w:lang w:eastAsia="ko-KR"/>
-        </w:rPr>
-        <w:t>: 3</w:t>
-      </w:r>
-      <w:r>
-        <w:rPr>
-          <w:rFonts w:hint="eastAsia"/>
-          <w:lang w:eastAsia="ko-KR"/>
-        </w:rPr>
-        <w:t>tbsp</w:t>
-      </w:r>
-      <w:r>
-        <w:rPr>
-          <w:rFonts w:hint="eastAsia"/>
-          <w:lang w:eastAsia="ko-KR"/>
-        </w:rPr>
-        <w:br/>
-      </w:r>
-      <w:r>
-        <w:rPr>
-          <w:rFonts w:hint="eastAsia"/>
-          <w:lang w:eastAsia="ko-KR"/>
-        </w:rPr>
-        <w:t>fish sauce</w:t>
-      </w:r>
-      <w:r>
-        <w:rPr>
-          <w:rFonts w:hint="eastAsia"/>
-          <w:lang w:eastAsia="ko-KR"/>
-        </w:rPr>
-        <w:t>: 3</w:t>
-      </w:r>
-      <w:r>
-        <w:rPr>
-          <w:rFonts w:hint="eastAsia"/>
-          <w:lang w:eastAsia="ko-KR"/>
-        </w:rPr>
-        <w:t>tbsp</w:t>
-      </w:r>
-      <w:r>
-        <w:rPr>
-          <w:rFonts w:hint="eastAsia"/>
-          <w:lang w:eastAsia="ko-KR"/>
-        </w:rPr>
-        <w:br/>
-      </w:r>
-      <w:r>
-        <w:rPr>
-          <w:rFonts w:hint="eastAsia"/>
-          <w:lang w:eastAsia="ko-KR"/>
-        </w:rPr>
-        <w:t xml:space="preserve">Beef </w:t>
-      </w:r>
-      <w:r>
-        <w:rPr>
-          <w:lang w:eastAsia="ko-KR"/>
-        </w:rPr>
-        <w:t>bouillon</w:t>
-      </w:r>
-      <w:r>
-        <w:rPr>
-          <w:rFonts w:hint="eastAsia"/>
-          <w:lang w:eastAsia="ko-KR"/>
-        </w:rPr>
-        <w:t>: 1</w:t>
-      </w:r>
-      <w:r>
-        <w:rPr>
-          <w:rFonts w:hint="eastAsia"/>
-          <w:lang w:eastAsia="ko-KR"/>
-        </w:rPr>
-        <w:t>tbsp</w:t>
-      </w:r>
-      <w:r>
-        <w:rPr>
-          <w:rFonts w:hint="eastAsia"/>
-          <w:lang w:eastAsia="ko-KR"/>
-        </w:rPr>
-        <w:br/>
-      </w:r>
-      <w:r>
-        <w:rPr>
-          <w:rFonts w:hint="eastAsia"/>
-          <w:lang w:eastAsia="ko-KR"/>
-        </w:rPr>
-        <w:t>Minced garlic</w:t>
-      </w:r>
-      <w:r>
-        <w:rPr>
-          <w:rFonts w:hint="eastAsia"/>
-          <w:lang w:eastAsia="ko-KR"/>
-        </w:rPr>
-        <w:t>: 1</w:t>
-      </w:r>
-      <w:r>
-        <w:rPr>
-          <w:rFonts w:hint="eastAsia"/>
-          <w:lang w:eastAsia="ko-KR"/>
-        </w:rPr>
-        <w:t>tbsp</w:t>
-      </w:r>
-      <w:r>
-        <w:rPr>
-          <w:rFonts w:hint="eastAsia"/>
-          <w:lang w:eastAsia="ko-KR"/>
-        </w:rPr>
-        <w:br/>
-      </w:r>
-      <w:r>
-        <w:rPr>
-          <w:rFonts w:hint="eastAsia"/>
-          <w:lang w:eastAsia="ko-KR"/>
-        </w:rPr>
-        <w:lastRenderedPageBreak/>
-        <w:t>Water if needed</w:t>
-      </w:r>
-      <w:r>
-        <w:rPr>
-          <w:rFonts w:hint="eastAsia"/>
-          <w:lang w:eastAsia="ko-KR"/>
-        </w:rPr>
-        <w:br/>
-      </w:r>
-      <w:r>
-        <w:rPr>
-          <w:rFonts w:hint="eastAsia"/>
-          <w:lang w:eastAsia="ko-KR"/>
-        </w:rPr>
-        <w:t>Tofu: as much as wanted</w:t>
-      </w:r>
-    </w:p>
-    <w:p>
-      <w:pPr>
-        <w:jc w:val="center"/>
-        <w:rPr>
-          <w:lang w:eastAsia="ko-KR"/>
-        </w:rPr>
-      </w:pPr>
-      <w:r>
-        <w:rPr>
-          <w:rFonts w:hint="eastAsia"/>
-          <w:lang w:eastAsia="ko-KR"/>
-        </w:rPr>
-        <w:t>Green o</w:t>
-      </w:r>
-      <w:r>
-        <w:rPr>
-          <w:lang w:eastAsia="ko-KR"/>
-        </w:rPr>
-        <w:t>nion</w:t>
-      </w:r>
-      <w:r>
-        <w:rPr>
-          <w:rFonts w:hint="eastAsia"/>
-          <w:lang w:eastAsia="ko-KR"/>
-        </w:rPr>
-        <w:t>: 200g</w:t>
-      </w:r>
-    </w:p>
-    <w:p>
-      <w:pPr>
-        <w:jc w:val="center"/>
-        <w:rPr>
-          <w:lang w:eastAsia="ko-KR"/>
-        </w:rPr>
-      </w:pPr>
-    </w:p>
-    <w:p>
-      <w:pPr>
-        <w:jc w:val="center"/>
-        <w:rPr>
-          <w:lang w:eastAsia="ko-KR"/>
-        </w:rPr>
-      </w:pPr>
-      <w:r>
-        <w:rPr>
-          <w:rFonts w:hint="eastAsia"/>
-          <w:lang w:eastAsia="ko-KR"/>
-        </w:rPr>
-        <w:t>Directions:</w:t>
-      </w:r>
-    </w:p>
-    <w:p>
-      <w:pPr>
-        <w:jc w:val="center"/>
-        <w:rPr>
-          <w:lang w:eastAsia="ko-KR"/>
-        </w:rPr>
-      </w:pPr>
-      <w:r>
-        <w:rPr>
-          <w:rFonts w:hint="eastAsia"/>
-          <w:lang w:eastAsia="ko-KR"/>
-        </w:rPr>
-        <w:t xml:space="preserve">This is </w:t>
-      </w:r>
-      <w:proofErr w:type="gramStart"/>
-      <w:r>
-        <w:rPr>
-          <w:rFonts w:hint="eastAsia"/>
-          <w:lang w:eastAsia="ko-KR"/>
-        </w:rPr>
-        <w:t>actually an</w:t>
-      </w:r>
-      <w:proofErr w:type="gramEnd"/>
-      <w:r>
-        <w:rPr>
-          <w:rFonts w:hint="eastAsia"/>
-          <w:lang w:eastAsia="ko-KR"/>
-        </w:rPr>
-        <w:t xml:space="preserve"> easy recipe.</w:t>
-      </w:r>
-    </w:p>
-    <w:p>
-      <w:pPr>
-        <w:jc w:val="center"/>
-        <w:rPr>
-          <w:rFonts w:hint="eastAsia"/>
-          <w:lang w:eastAsia="ko-KR"/>
-        </w:rPr>
-      </w:pPr>
-      <w:r>
-        <w:rPr>
-          <w:rFonts w:hint="eastAsia"/>
-          <w:lang w:eastAsia="ko-KR"/>
-        </w:rPr>
-        <w:t>Put everything and then boil it until the meat is cooked.</w:t>
-      </w:r>
-    </w:p>
-    <w:p>
-      <w:pPr>
-        <w:jc w:val="center"/>
-        <w:rPr>
-          <w:rFonts w:hint="eastAsia"/>
-          <w:lang w:eastAsia="ko-KR"/>
-        </w:rPr>
-      </w:pPr>
-    </w:p>
-    <w:p>
-      <w:pPr>
-        <w:jc w:val="center"/>
-        <w:rPr>
-          <w:lang w:eastAsia="ko-KR"/>
-        </w:rPr>
-      </w:pPr>
-      <w:r>
-        <w:rPr>
-          <w:rFonts w:hint="eastAsia"/>
-          <w:lang w:eastAsia="ko-KR"/>
-        </w:rPr>
-        <w:t xml:space="preserve">Recipe 2 </w:t>
-      </w:r>
-      <w:r>
-        <w:rPr>
-          <w:lang w:eastAsia="ko-KR"/>
-        </w:rPr>
-        <w:t>–</w:t>
-      </w:r>
-      <w:r>
-        <w:rPr>
-          <w:rFonts w:hint="eastAsia"/>
-          <w:lang w:eastAsia="ko-KR"/>
-        </w:rPr>
-        <w:t xml:space="preserve"> Bulgogi</w:t>
       </w:r>
     </w:p>
     <w:p>
@@ -2082,7 +1730,373 @@
       <w:hyperlink r:id="rId13" w:history="1">
         <w:r>
           <w:rPr>
-            <w:rStyle w:val="a4"/>
+            <w:rStyle w:val="Hyperlink"/>
+            <w:lang w:eastAsia="ko-KR"/>
+          </w:rPr>
+          <w:t>https://chef-choice.tis</w:t>
+        </w:r>
+        <w:r>
+          <w:rPr>
+            <w:rStyle w:val="Hyperlink"/>
+            <w:lang w:eastAsia="ko-KR"/>
+          </w:rPr>
+          <w:t>t</w:t>
+        </w:r>
+        <w:r>
+          <w:rPr>
+            <w:rStyle w:val="Hyperlink"/>
+            <w:lang w:eastAsia="ko-KR"/>
+          </w:rPr>
+          <w:t>ory.com/372</w:t>
+        </w:r>
+      </w:hyperlink>
+      <w:r>
+        <w:rPr>
+          <w:lang w:eastAsia="ko-KR"/>
+        </w:rPr>
+        <w:t xml:space="preserve"> </w:t>
+      </w:r>
+      <w:r>
+        <w:rPr>
+          <w:rFonts w:hint="eastAsia"/>
+          <w:lang w:eastAsia="ko-KR"/>
+        </w:rPr>
+        <w:br/>
+      </w:r>
+      <w:r>
+        <w:rPr>
+          <w:rFonts w:hint="eastAsia"/>
+          <w:lang w:eastAsia="ko-KR"/>
+        </w:rPr>
+        <w:t>Beef broth</w:t>
+      </w:r>
+      <w:r>
+        <w:rPr>
+          <w:rFonts w:hint="eastAsia"/>
+          <w:lang w:eastAsia="ko-KR"/>
+        </w:rPr>
+        <w:t>: 1L</w:t>
+      </w:r>
+      <w:r>
+        <w:rPr>
+          <w:rFonts w:hint="eastAsia"/>
+          <w:lang w:eastAsia="ko-KR"/>
+        </w:rPr>
+        <w:br/>
+      </w:r>
+      <w:r>
+        <w:rPr>
+          <w:rFonts w:hint="eastAsia"/>
+          <w:lang w:eastAsia="ko-KR"/>
+        </w:rPr>
+        <w:t>Kimchi: 1 cabbage</w:t>
+      </w:r>
+      <w:r>
+        <w:rPr>
+          <w:rFonts w:hint="eastAsia"/>
+          <w:lang w:eastAsia="ko-KR"/>
+        </w:rPr>
+        <w:br/>
+      </w:r>
+      <w:r>
+        <w:rPr>
+          <w:rFonts w:hint="eastAsia"/>
+          <w:lang w:eastAsia="ko-KR"/>
+        </w:rPr>
+        <w:t>Pork belly: 400g</w:t>
+      </w:r>
+      <w:r>
+        <w:rPr>
+          <w:rFonts w:hint="eastAsia"/>
+          <w:lang w:eastAsia="ko-KR"/>
+        </w:rPr>
+        <w:br/>
+      </w:r>
+      <w:r>
+        <w:rPr>
+          <w:rFonts w:hint="eastAsia"/>
+          <w:lang w:eastAsia="ko-KR"/>
+        </w:rPr>
+        <w:t>Ground red pepper</w:t>
+      </w:r>
+      <w:r>
+        <w:rPr>
+          <w:rFonts w:hint="eastAsia"/>
+          <w:lang w:eastAsia="ko-KR"/>
+        </w:rPr>
+        <w:t>: 3</w:t>
+      </w:r>
+      <w:r>
+        <w:rPr>
+          <w:rFonts w:hint="eastAsia"/>
+          <w:lang w:eastAsia="ko-KR"/>
+        </w:rPr>
+        <w:t>tbsp</w:t>
+      </w:r>
+      <w:r>
+        <w:rPr>
+          <w:rFonts w:hint="eastAsia"/>
+          <w:lang w:eastAsia="ko-KR"/>
+        </w:rPr>
+        <w:br/>
+      </w:r>
+      <w:r>
+        <w:rPr>
+          <w:rFonts w:hint="eastAsia"/>
+          <w:lang w:eastAsia="ko-KR"/>
+        </w:rPr>
+        <w:t>fish sauce</w:t>
+      </w:r>
+      <w:r>
+        <w:rPr>
+          <w:rFonts w:hint="eastAsia"/>
+          <w:lang w:eastAsia="ko-KR"/>
+        </w:rPr>
+        <w:t>: 3</w:t>
+      </w:r>
+      <w:r>
+        <w:rPr>
+          <w:rFonts w:hint="eastAsia"/>
+          <w:lang w:eastAsia="ko-KR"/>
+        </w:rPr>
+        <w:t>tbsp</w:t>
+      </w:r>
+      <w:r>
+        <w:rPr>
+          <w:rFonts w:hint="eastAsia"/>
+          <w:lang w:eastAsia="ko-KR"/>
+        </w:rPr>
+        <w:br/>
+      </w:r>
+      <w:r>
+        <w:rPr>
+          <w:rFonts w:hint="eastAsia"/>
+          <w:lang w:eastAsia="ko-KR"/>
+        </w:rPr>
+        <w:t xml:space="preserve">Beef </w:t>
+      </w:r>
+      <w:r>
+        <w:rPr>
+          <w:lang w:eastAsia="ko-KR"/>
+        </w:rPr>
+        <w:t>bouillon</w:t>
+      </w:r>
+      <w:r>
+        <w:rPr>
+          <w:rFonts w:hint="eastAsia"/>
+          <w:lang w:eastAsia="ko-KR"/>
+        </w:rPr>
+        <w:t>: 1</w:t>
+      </w:r>
+      <w:r>
+        <w:rPr>
+          <w:rFonts w:hint="eastAsia"/>
+          <w:lang w:eastAsia="ko-KR"/>
+        </w:rPr>
+        <w:t>tbsp</w:t>
+      </w:r>
+      <w:r>
+        <w:rPr>
+          <w:rFonts w:hint="eastAsia"/>
+          <w:lang w:eastAsia="ko-KR"/>
+        </w:rPr>
+        <w:br/>
+      </w:r>
+      <w:r>
+        <w:rPr>
+          <w:rFonts w:hint="eastAsia"/>
+          <w:lang w:eastAsia="ko-KR"/>
+        </w:rPr>
+        <w:t>Minced garlic</w:t>
+      </w:r>
+      <w:r>
+        <w:rPr>
+          <w:rFonts w:hint="eastAsia"/>
+          <w:lang w:eastAsia="ko-KR"/>
+        </w:rPr>
+        <w:t>: 1</w:t>
+      </w:r>
+      <w:r>
+        <w:rPr>
+          <w:rFonts w:hint="eastAsia"/>
+          <w:lang w:eastAsia="ko-KR"/>
+        </w:rPr>
+        <w:t>tbsp</w:t>
+      </w:r>
+      <w:r>
+        <w:rPr>
+          <w:rFonts w:hint="eastAsia"/>
+          <w:lang w:eastAsia="ko-KR"/>
+        </w:rPr>
+        <w:br/>
+      </w:r>
+      <w:r>
+        <w:rPr>
+          <w:rFonts w:hint="eastAsia"/>
+          <w:lang w:eastAsia="ko-KR"/>
+        </w:rPr>
+        <w:lastRenderedPageBreak/>
+        <w:t>Water if needed</w:t>
+      </w:r>
+      <w:r>
+        <w:rPr>
+          <w:rFonts w:hint="eastAsia"/>
+          <w:lang w:eastAsia="ko-KR"/>
+        </w:rPr>
+        <w:br/>
+      </w:r>
+      <w:r>
+        <w:rPr>
+          <w:rFonts w:hint="eastAsia"/>
+          <w:lang w:eastAsia="ko-KR"/>
+        </w:rPr>
+        <w:t>Tofu: as much as wanted</w:t>
+      </w:r>
+    </w:p>
+    <w:p>
+      <w:pPr>
+        <w:jc w:val="center"/>
+        <w:rPr>
+          <w:lang w:eastAsia="ko-KR"/>
+        </w:rPr>
+      </w:pPr>
+      <w:r>
+        <w:rPr>
+          <w:rFonts w:hint="eastAsia"/>
+          <w:lang w:eastAsia="ko-KR"/>
+        </w:rPr>
+        <w:t>Green o</w:t>
+      </w:r>
+      <w:r>
+        <w:rPr>
+          <w:lang w:eastAsia="ko-KR"/>
+        </w:rPr>
+        <w:t>nion</w:t>
+      </w:r>
+      <w:r>
+        <w:rPr>
+          <w:rFonts w:hint="eastAsia"/>
+          <w:lang w:eastAsia="ko-KR"/>
+        </w:rPr>
+        <w:t>: 200g</w:t>
+      </w:r>
+    </w:p>
+    <w:p>
+      <w:pPr>
+        <w:jc w:val="center"/>
+        <w:rPr>
+          <w:lang w:eastAsia="ko-KR"/>
+        </w:rPr>
+      </w:pPr>
+    </w:p>
+    <w:p>
+      <w:pPr>
+        <w:jc w:val="center"/>
+        <w:rPr>
+          <w:lang w:eastAsia="ko-KR"/>
+        </w:rPr>
+      </w:pPr>
+      <w:r>
+        <w:rPr>
+          <w:rFonts w:hint="eastAsia"/>
+          <w:lang w:eastAsia="ko-KR"/>
+        </w:rPr>
+        <w:t>Directions:</w:t>
+      </w:r>
+    </w:p>
+    <w:p>
+      <w:pPr>
+        <w:jc w:val="center"/>
+        <w:rPr>
+          <w:lang w:eastAsia="ko-KR"/>
+        </w:rPr>
+      </w:pPr>
+      <w:r>
+        <w:rPr>
+          <w:rFonts w:hint="eastAsia"/>
+          <w:lang w:eastAsia="ko-KR"/>
+        </w:rPr>
+        <w:t xml:space="preserve">This is </w:t>
+      </w:r>
+      <w:proofErr w:type="gramStart"/>
+      <w:r>
+        <w:rPr>
+          <w:rFonts w:hint="eastAsia"/>
+          <w:lang w:eastAsia="ko-KR"/>
+        </w:rPr>
+        <w:t>actually an</w:t>
+      </w:r>
+      <w:proofErr w:type="gramEnd"/>
+      <w:r>
+        <w:rPr>
+          <w:rFonts w:hint="eastAsia"/>
+          <w:lang w:eastAsia="ko-KR"/>
+        </w:rPr>
+        <w:t xml:space="preserve"> easy recipe.</w:t>
+      </w:r>
+    </w:p>
+    <w:p>
+      <w:pPr>
+        <w:jc w:val="center"/>
+        <w:rPr>
+          <w:lang w:eastAsia="ko-KR"/>
+        </w:rPr>
+      </w:pPr>
+      <w:r>
+        <w:rPr>
+          <w:rFonts w:hint="eastAsia"/>
+          <w:lang w:eastAsia="ko-KR"/>
+        </w:rPr>
+        <w:t>Put everything and then boil it until the meat is cooked.</w:t>
+      </w:r>
+    </w:p>
+    <w:p>
+      <w:pPr>
+        <w:jc w:val="center"/>
+        <w:rPr>
+          <w:lang w:eastAsia="ko-KR"/>
+        </w:rPr>
+      </w:pPr>
+    </w:p>
+    <w:p>
+      <w:pPr>
+        <w:jc w:val="center"/>
+        <w:rPr>
+          <w:lang w:eastAsia="ko-KR"/>
+        </w:rPr>
+      </w:pPr>
+      <w:r>
+        <w:rPr>
+          <w:rFonts w:hint="eastAsia"/>
+          <w:lang w:eastAsia="ko-KR"/>
+        </w:rPr>
+        <w:t xml:space="preserve">Recipe 2 </w:t>
+      </w:r>
+      <w:r>
+        <w:rPr>
+          <w:lang w:eastAsia="ko-KR"/>
+        </w:rPr>
+        <w:t>–</w:t>
+      </w:r>
+      <w:r>
+        <w:rPr>
+          <w:rFonts w:hint="eastAsia"/>
+          <w:lang w:eastAsia="ko-KR"/>
+        </w:rPr>
+        <w:t xml:space="preserve"> Bulgogi</w:t>
+      </w:r>
+    </w:p>
+    <w:p>
+      <w:pPr>
+        <w:jc w:val="center"/>
+        <w:rPr>
+          <w:lang w:eastAsia="ko-KR"/>
+        </w:rPr>
+      </w:pPr>
+      <w:hyperlink r:id="rId14" w:history="1">
+        <w:r>
+          <w:rPr>
+            <w:rStyle w:val="Hyperlink"/>
             <w:lang w:eastAsia="ko-KR"/>
           </w:rPr>
           <w:t>https://chef-choice.tistory.com/42</w:t>
@@ -2167,7 +2181,6 @@
       <w:pPr>
         <w:jc w:val="center"/>
         <w:rPr>
-          <w:rFonts w:hint="eastAsia"/>
           <w:lang w:eastAsia="ko-KR"/>
         </w:rPr>
       </w:pPr>
@@ -2182,21 +2195,7 @@
           <w:rFonts w:hint="eastAsia"/>
           <w:lang w:eastAsia="ko-KR"/>
         </w:rPr>
-        <w:t xml:space="preserve">ooking </w:t>
-      </w:r>
-      <w:r>
-        <w:rPr>
-          <w:rFonts w:hint="eastAsia"/>
-          <w:lang w:eastAsia="ko-KR"/>
-        </w:rPr>
-        <w:t>wine</w:t>
-      </w:r>
-      <w:r>
-        <w:rPr>
-          <w:rFonts w:hint="eastAsia"/>
-          <w:lang w:eastAsia="ko-KR"/>
-        </w:rPr>
-        <w:t>:</w:t>
+        <w:t>ooking wine:</w:t>
       </w:r>
       <w:r>
         <w:rPr>
@@ -2210,7 +2209,6 @@
       <w:pPr>
         <w:jc w:val="center"/>
         <w:rPr>
-          <w:rFonts w:hint="eastAsia"/>
           <w:lang w:eastAsia="ko-KR"/>
         </w:rPr>
       </w:pPr>
@@ -2240,7 +2238,6 @@
       <w:pPr>
         <w:jc w:val="center"/>
         <w:rPr>
-          <w:rFonts w:hint="eastAsia"/>
           <w:lang w:eastAsia="ko-KR"/>
         </w:rPr>
       </w:pPr>
@@ -2270,7 +2267,6 @@
       <w:pPr>
         <w:jc w:val="center"/>
         <w:rPr>
-          <w:rFonts w:hint="eastAsia"/>
           <w:lang w:eastAsia="ko-KR"/>
         </w:rPr>
       </w:pPr>
@@ -2300,7 +2296,6 @@
       <w:pPr>
         <w:jc w:val="center"/>
         <w:rPr>
-          <w:rFonts w:hint="eastAsia"/>
           <w:lang w:eastAsia="ko-KR"/>
         </w:rPr>
       </w:pPr>
@@ -2342,7 +2337,6 @@
       <w:pPr>
         <w:jc w:val="center"/>
         <w:rPr>
-          <w:rFonts w:hint="eastAsia"/>
           <w:lang w:eastAsia="ko-KR"/>
         </w:rPr>
       </w:pPr>
@@ -2372,7 +2366,6 @@
       <w:pPr>
         <w:jc w:val="center"/>
         <w:rPr>
-          <w:rFonts w:hint="eastAsia"/>
           <w:lang w:eastAsia="ko-KR"/>
         </w:rPr>
       </w:pPr>
@@ -2408,7 +2401,6 @@
       <w:pPr>
         <w:jc w:val="center"/>
         <w:rPr>
-          <w:rFonts w:hint="eastAsia"/>
           <w:lang w:eastAsia="ko-KR"/>
         </w:rPr>
       </w:pPr>
@@ -2451,7 +2443,6 @@
       <w:pPr>
         <w:jc w:val="center"/>
         <w:rPr>
-          <w:rFonts w:hint="eastAsia"/>
           <w:lang w:eastAsia="ko-KR"/>
         </w:rPr>
       </w:pPr>
@@ -2502,7 +2493,7 @@
     </w:p>
     <w:p>
       <w:pPr>
-        <w:pStyle w:val="a7"/>
+        <w:pStyle w:val="ListParagraph"/>
         <w:numPr>
           <w:ilvl w:val="0"/>
           <w:numId w:val="2"/>
@@ -2523,7 +2514,7 @@
     </w:p>
     <w:p>
       <w:pPr>
-        <w:pStyle w:val="a7"/>
+        <w:pStyle w:val="ListParagraph"/>
         <w:numPr>
           <w:ilvl w:val="0"/>
           <w:numId w:val="2"/>
@@ -2589,7 +2580,7 @@
     </w:p>
     <w:p>
       <w:pPr>
-        <w:pStyle w:val="a7"/>
+        <w:pStyle w:val="ListParagraph"/>
         <w:numPr>
           <w:ilvl w:val="0"/>
           <w:numId w:val="2"/>
@@ -2610,7 +2601,7 @@
     </w:p>
     <w:p>
       <w:pPr>
-        <w:pStyle w:val="a7"/>
+        <w:pStyle w:val="ListParagraph"/>
         <w:numPr>
           <w:ilvl w:val="0"/>
           <w:numId w:val="2"/>
@@ -2973,7 +2964,7 @@
     </w:p>
     <w:p>
       <w:pPr>
-        <w:pStyle w:val="a7"/>
+        <w:pStyle w:val="ListParagraph"/>
         <w:numPr>
           <w:ilvl w:val="0"/>
           <w:numId w:val="3"/>
@@ -2994,7 +2985,7 @@
     </w:p>
     <w:p>
       <w:pPr>
-        <w:pStyle w:val="a7"/>
+        <w:pStyle w:val="ListParagraph"/>
         <w:numPr>
           <w:ilvl w:val="0"/>
           <w:numId w:val="3"/>
@@ -3031,7 +3022,7 @@
     </w:p>
     <w:p>
       <w:pPr>
-        <w:pStyle w:val="a7"/>
+        <w:pStyle w:val="ListParagraph"/>
         <w:numPr>
           <w:ilvl w:val="0"/>
           <w:numId w:val="3"/>
@@ -3065,7 +3056,7 @@
     </w:p>
     <w:p>
       <w:pPr>
-        <w:pStyle w:val="a7"/>
+        <w:pStyle w:val="ListParagraph"/>
         <w:numPr>
           <w:ilvl w:val="0"/>
           <w:numId w:val="3"/>
@@ -3102,7 +3093,7 @@
     </w:p>
     <w:p>
       <w:pPr>
-        <w:pStyle w:val="a7"/>
+        <w:pStyle w:val="ListParagraph"/>
         <w:numPr>
           <w:ilvl w:val="0"/>
           <w:numId w:val="3"/>
@@ -3123,7 +3114,7 @@
     </w:p>
     <w:p>
       <w:pPr>
-        <w:pStyle w:val="a7"/>
+        <w:pStyle w:val="ListParagraph"/>
         <w:numPr>
           <w:ilvl w:val="0"/>
           <w:numId w:val="3"/>
@@ -3131,7 +3122,6 @@
         <w:ind w:leftChars="0"/>
         <w:jc w:val="center"/>
         <w:rPr>
-          <w:rFonts w:hint="eastAsia"/>
           <w:lang w:eastAsia="ko-KR"/>
         </w:rPr>
       </w:pPr>
@@ -3171,7 +3161,6 @@
       <w:pPr>
         <w:jc w:val="center"/>
         <w:rPr>
-          <w:rFonts w:hint="eastAsia"/>
           <w:lang w:eastAsia="ko-KR"/>
         </w:rPr>
       </w:pPr>
@@ -3406,23 +3395,7 @@
           <w:rFonts w:hint="eastAsia"/>
           <w:lang w:eastAsia="ko-KR"/>
         </w:rPr>
-        <w:t xml:space="preserve">Kimchi, different types of soy sauce, different types of tofu, different types of </w:t>
-      </w:r>
-      <w:proofErr w:type="gramStart"/>
-      <w:r>
-        <w:rPr>
-          <w:rFonts w:hint="eastAsia"/>
-          <w:lang w:eastAsia="ko-KR"/>
-        </w:rPr>
-        <w:t>soybean</w:t>
-      </w:r>
-      <w:proofErr w:type="gramEnd"/>
-      <w:r>
-        <w:rPr>
-          <w:rFonts w:hint="eastAsia"/>
-          <w:lang w:eastAsia="ko-KR"/>
-        </w:rPr>
-        <w:t xml:space="preserve"> paste, etc.</w:t>
+        <w:t>Kimchi, different types of soy sauce, different types of tofu, different types of soybean paste, etc.</w:t>
       </w:r>
     </w:p>
     <w:p>
@@ -3976,7 +3949,7 @@
     </w:p>
     <w:p>
       <w:pPr>
-        <w:pStyle w:val="3"/>
+        <w:pStyle w:val="Heading3"/>
         <w:jc w:val="center"/>
         <w:rPr>
           <w:lang w:eastAsia="ko-KR"/>
@@ -3991,7 +3964,7 @@
     </w:p>
     <w:p>
       <w:pPr>
-        <w:pStyle w:val="3"/>
+        <w:pStyle w:val="Heading3"/>
         <w:jc w:val="center"/>
         <w:rPr>
           <w:lang w:eastAsia="ko-KR"/>
@@ -4018,7 +3991,7 @@
                     <pic:cNvPicPr/>
                   </pic:nvPicPr>
                   <pic:blipFill>
-                    <a:blip r:embed="rId14">
+                    <a:blip r:embed="rId15">
                       <a:extLst>
                         <a:ext uri="{28A0092B-C50C-407E-A947-70E740481C1C}">
                           <a14:useLocalDpi xmlns:a14="http://schemas.microsoft.com/office/drawing/2010/main" val="0"/>
@@ -4047,7 +4020,7 @@
     </w:p>
     <w:p>
       <w:pPr>
-        <w:pStyle w:val="3"/>
+        <w:pStyle w:val="Heading3"/>
         <w:jc w:val="center"/>
         <w:rPr>
           <w:lang w:eastAsia="ko-KR"/>
@@ -4063,7 +4036,7 @@
     </w:p>
     <w:p>
       <w:pPr>
-        <w:pStyle w:val="3"/>
+        <w:pStyle w:val="Heading3"/>
         <w:jc w:val="center"/>
         <w:rPr>
           <w:lang w:eastAsia="ko-KR"/>
@@ -4090,7 +4063,7 @@
                     <pic:cNvPicPr/>
                   </pic:nvPicPr>
                   <pic:blipFill>
-                    <a:blip r:embed="rId15">
+                    <a:blip r:embed="rId16">
                       <a:extLst>
                         <a:ext uri="{28A0092B-C50C-407E-A947-70E740481C1C}">
                           <a14:useLocalDpi xmlns:a14="http://schemas.microsoft.com/office/drawing/2010/main" val="0"/>
@@ -4119,10 +4092,9 @@
     </w:p>
     <w:p>
       <w:pPr>
-        <w:pStyle w:val="3"/>
-        <w:jc w:val="center"/>
-        <w:rPr>
-          <w:rFonts w:hint="eastAsia"/>
+        <w:pStyle w:val="Heading3"/>
+        <w:jc w:val="center"/>
+        <w:rPr>
           <w:lang w:eastAsia="ko-KR"/>
         </w:rPr>
       </w:pPr>
@@ -4163,7 +4135,7 @@
                     <pic:cNvPicPr/>
                   </pic:nvPicPr>
                   <pic:blipFill>
-                    <a:blip r:embed="rId16">
+                    <a:blip r:embed="rId17">
                       <a:extLst>
                         <a:ext uri="{28A0092B-C50C-407E-A947-70E740481C1C}">
                           <a14:useLocalDpi xmlns:a14="http://schemas.microsoft.com/office/drawing/2010/main" val="0"/>
@@ -4930,7 +4902,7 @@
     <w:lsdException w:name="Unresolved Mention" w:semiHidden="1" w:unhideWhenUsed="1"/>
     <w:lsdException w:name="Smart Link" w:semiHidden="1" w:unhideWhenUsed="1"/>
   </w:latentStyles>
-  <w:style w:type="paragraph" w:default="1" w:styleId="a">
+  <w:style w:type="paragraph" w:default="1" w:styleId="Normal">
     <w:name w:val="Normal"/>
     <w:qFormat/>
     <w:rPr>
@@ -4938,10 +4910,10 @@
       <w:szCs w:val="24"/>
     </w:rPr>
   </w:style>
-  <w:style w:type="paragraph" w:styleId="1">
+  <w:style w:type="paragraph" w:styleId="Heading1">
     <w:name w:val="heading 1"/>
-    <w:basedOn w:val="a"/>
-    <w:link w:val="1Char"/>
+    <w:basedOn w:val="Normal"/>
+    <w:link w:val="Heading1Char"/>
     <w:uiPriority w:val="9"/>
     <w:qFormat/>
     <w:pPr>
@@ -4956,10 +4928,10 @@
       <w:szCs w:val="48"/>
     </w:rPr>
   </w:style>
-  <w:style w:type="paragraph" w:styleId="2">
+  <w:style w:type="paragraph" w:styleId="Heading2">
     <w:name w:val="heading 2"/>
-    <w:basedOn w:val="a"/>
-    <w:link w:val="2Char"/>
+    <w:basedOn w:val="Normal"/>
+    <w:link w:val="Heading2Char"/>
     <w:uiPriority w:val="9"/>
     <w:qFormat/>
     <w:pPr>
@@ -4973,10 +4945,10 @@
       <w:szCs w:val="36"/>
     </w:rPr>
   </w:style>
-  <w:style w:type="paragraph" w:styleId="3">
+  <w:style w:type="paragraph" w:styleId="Heading3">
     <w:name w:val="heading 3"/>
-    <w:basedOn w:val="a"/>
-    <w:link w:val="3Char"/>
+    <w:basedOn w:val="Normal"/>
+    <w:link w:val="Heading3Char"/>
     <w:uiPriority w:val="9"/>
     <w:qFormat/>
     <w:pPr>
@@ -4990,10 +4962,10 @@
       <w:szCs w:val="27"/>
     </w:rPr>
   </w:style>
-  <w:style w:type="paragraph" w:styleId="4">
+  <w:style w:type="paragraph" w:styleId="Heading4">
     <w:name w:val="heading 4"/>
-    <w:basedOn w:val="a"/>
-    <w:link w:val="4Char"/>
+    <w:basedOn w:val="Normal"/>
+    <w:link w:val="Heading4Char"/>
     <w:uiPriority w:val="9"/>
     <w:qFormat/>
     <w:pPr>
@@ -5005,12 +4977,13 @@
       <w:bCs/>
     </w:rPr>
   </w:style>
-  <w:style w:type="character" w:default="1" w:styleId="a0">
+  <w:style w:type="character" w:default="1" w:styleId="DefaultParagraphFont">
     <w:name w:val="Default Paragraph Font"/>
     <w:uiPriority w:val="1"/>
+    <w:semiHidden/>
     <w:unhideWhenUsed/>
   </w:style>
-  <w:style w:type="table" w:default="1" w:styleId="a1">
+  <w:style w:type="table" w:default="1" w:styleId="TableNormal">
     <w:name w:val="Normal Table"/>
     <w:uiPriority w:val="99"/>
     <w:semiHidden/>
@@ -5025,7 +4998,7 @@
       </w:tblCellMar>
     </w:tblPr>
   </w:style>
-  <w:style w:type="numbering" w:default="1" w:styleId="a2">
+  <w:style w:type="numbering" w:default="1" w:styleId="NoList">
     <w:name w:val="No List"/>
     <w:uiPriority w:val="99"/>
     <w:semiHidden/>
@@ -5033,15 +5006,15 @@
   </w:style>
   <w:style w:type="paragraph" w:customStyle="1" w:styleId="msonormal0">
     <w:name w:val="msonormal"/>
-    <w:basedOn w:val="a"/>
+    <w:basedOn w:val="Normal"/>
     <w:pPr>
       <w:spacing w:before="100" w:beforeAutospacing="1" w:after="100" w:afterAutospacing="1"/>
     </w:pPr>
   </w:style>
-  <w:style w:type="character" w:customStyle="1" w:styleId="1Char">
-    <w:name w:val="제목 1 Char"/>
-    <w:basedOn w:val="a0"/>
-    <w:link w:val="1"/>
+  <w:style w:type="character" w:customStyle="1" w:styleId="Heading1Char">
+    <w:name w:val="Heading 1 Char"/>
+    <w:basedOn w:val="DefaultParagraphFont"/>
+    <w:link w:val="Heading1"/>
     <w:uiPriority w:val="9"/>
     <w:rPr>
       <w:rFonts w:asciiTheme="majorHAnsi" w:eastAsiaTheme="majorEastAsia" w:hAnsiTheme="majorHAnsi" w:cstheme="majorBidi"/>
@@ -5050,10 +5023,10 @@
       <w:szCs w:val="32"/>
     </w:rPr>
   </w:style>
-  <w:style w:type="character" w:customStyle="1" w:styleId="2Char">
-    <w:name w:val="제목 2 Char"/>
-    <w:basedOn w:val="a0"/>
-    <w:link w:val="2"/>
+  <w:style w:type="character" w:customStyle="1" w:styleId="Heading2Char">
+    <w:name w:val="Heading 2 Char"/>
+    <w:basedOn w:val="DefaultParagraphFont"/>
+    <w:link w:val="Heading2"/>
     <w:uiPriority w:val="9"/>
     <w:semiHidden/>
     <w:rPr>
@@ -5063,10 +5036,10 @@
       <w:szCs w:val="26"/>
     </w:rPr>
   </w:style>
-  <w:style w:type="character" w:customStyle="1" w:styleId="3Char">
-    <w:name w:val="제목 3 Char"/>
-    <w:basedOn w:val="a0"/>
-    <w:link w:val="3"/>
+  <w:style w:type="character" w:customStyle="1" w:styleId="Heading3Char">
+    <w:name w:val="Heading 3 Char"/>
+    <w:basedOn w:val="DefaultParagraphFont"/>
+    <w:link w:val="Heading3"/>
     <w:uiPriority w:val="9"/>
     <w:semiHidden/>
     <w:rPr>
@@ -5076,9 +5049,9 @@
       <w:szCs w:val="24"/>
     </w:rPr>
   </w:style>
-  <w:style w:type="paragraph" w:styleId="a3">
+  <w:style w:type="paragraph" w:styleId="NormalWeb">
     <w:name w:val="Normal (Web)"/>
-    <w:basedOn w:val="a"/>
+    <w:basedOn w:val="Normal"/>
     <w:uiPriority w:val="99"/>
     <w:semiHidden/>
     <w:unhideWhenUsed/>
@@ -5086,10 +5059,10 @@
       <w:spacing w:before="100" w:beforeAutospacing="1" w:after="100" w:afterAutospacing="1"/>
     </w:pPr>
   </w:style>
-  <w:style w:type="character" w:customStyle="1" w:styleId="4Char">
-    <w:name w:val="제목 4 Char"/>
-    <w:basedOn w:val="a0"/>
-    <w:link w:val="4"/>
+  <w:style w:type="character" w:customStyle="1" w:styleId="Heading4Char">
+    <w:name w:val="Heading 4 Char"/>
+    <w:basedOn w:val="DefaultParagraphFont"/>
+    <w:link w:val="Heading4"/>
     <w:uiPriority w:val="9"/>
     <w:semiHidden/>
     <w:rPr>
@@ -5103,14 +5076,14 @@
   </w:style>
   <w:style w:type="paragraph" w:customStyle="1" w:styleId="colored">
     <w:name w:val="colored"/>
-    <w:basedOn w:val="a"/>
+    <w:basedOn w:val="Normal"/>
     <w:pPr>
       <w:spacing w:before="100" w:beforeAutospacing="1" w:after="100" w:afterAutospacing="1"/>
     </w:pPr>
   </w:style>
-  <w:style w:type="character" w:styleId="a4">
+  <w:style w:type="character" w:styleId="Hyperlink">
     <w:name w:val="Hyperlink"/>
-    <w:basedOn w:val="a0"/>
+    <w:basedOn w:val="DefaultParagraphFont"/>
     <w:uiPriority w:val="99"/>
     <w:unhideWhenUsed/>
     <w:rPr>
@@ -5118,9 +5091,9 @@
       <w:u w:val="single"/>
     </w:rPr>
   </w:style>
-  <w:style w:type="character" w:styleId="a5">
+  <w:style w:type="character" w:styleId="FollowedHyperlink">
     <w:name w:val="FollowedHyperlink"/>
-    <w:basedOn w:val="a0"/>
+    <w:basedOn w:val="DefaultParagraphFont"/>
     <w:uiPriority w:val="99"/>
     <w:semiHidden/>
     <w:unhideWhenUsed/>
@@ -5129,9 +5102,9 @@
       <w:u w:val="single"/>
     </w:rPr>
   </w:style>
-  <w:style w:type="character" w:styleId="a6">
+  <w:style w:type="character" w:styleId="UnresolvedMention">
     <w:name w:val="Unresolved Mention"/>
-    <w:basedOn w:val="a0"/>
+    <w:basedOn w:val="DefaultParagraphFont"/>
     <w:uiPriority w:val="99"/>
     <w:semiHidden/>
     <w:unhideWhenUsed/>
@@ -5141,9 +5114,9 @@
       <w:shd w:val="clear" w:color="auto" w:fill="E1DFDD"/>
     </w:rPr>
   </w:style>
-  <w:style w:type="paragraph" w:styleId="a7">
+  <w:style w:type="paragraph" w:styleId="ListParagraph">
     <w:name w:val="List Paragraph"/>
-    <w:basedOn w:val="a"/>
+    <w:basedOn w:val="Normal"/>
     <w:uiPriority w:val="34"/>
     <w:qFormat/>
     <w:rsid w:val="003D4A87"/>

</xml_diff>